<commit_message>
docs: refresh final defense materials
</commit_message>
<xml_diff>
--- a/docx/word/01_轴承寿命预测与故障诊断系统_开题报告_zyj.docx
+++ b/docx/word/01_轴承寿命预测与故障诊断系统_开题报告_zyj.docx
@@ -251,7 +251,7 @@
         <w:rPr>
           <w:rStyle w:val="VerbatimChar"/>
         </w:rPr>
-        <w:t xml:space="preserve">phm2</w:t>
+        <w:t xml:space="preserve">main</w:t>
       </w:r>
       <w:r>
         <w:t xml:space="preserve"> </w:t>
@@ -331,7 +331,7 @@
         <w:pStyle w:val="BodyText"/>
       </w:pPr>
       <w:r>
-        <w:t xml:space="preserve">当前代码采用 Python 3.11、uv 包管理和 PyTorch 2.10 依赖范围。源码物理路径为</w:t>
+        <w:t xml:space="preserve">当前代码采用 Python 3.11、uv 包管理和 PyTorch 2.10 依赖范围。系统通过</w:t>
       </w:r>
       <w:r>
         <w:t xml:space="preserve"> </w:t>
@@ -340,10 +340,13 @@
         <w:rPr>
           <w:rStyle w:val="VerbatimChar"/>
         </w:rPr>
-        <w:t xml:space="preserve">src/USTC/SSE/BearingPrediction</w:t>
-      </w:r>
-      <w:r>
-        <w:t xml:space="preserve">，示例和 Notebook 中推荐通过</w:t>
+        <w:t xml:space="preserve">phm</w:t>
+      </w:r>
+      <w:r>
+        <w:t xml:space="preserve"> </w:t>
+      </w:r>
+      <w:r>
+        <w:t xml:space="preserve">命令运行分析、训练和 benchmark，示例代码推荐通过</w:t>
       </w:r>
       <w:r>
         <w:t xml:space="preserve"> </w:t>
@@ -460,7 +463,7 @@
         <w:pStyle w:val="Compact"/>
       </w:pPr>
       <w:r>
-        <w:t xml:space="preserve">工程可行：系统已有 loader、processor、labeler、model、trainer、tester 和 notebook 示例，适合按课程阶段输出证据。</w:t>
+        <w:t xml:space="preserve">工程可行：系统已有 loader、processor、labeler、model、trainer、tester 和 CLI 示例，适合按课程阶段输出证据。</w:t>
       </w:r>
     </w:p>
     <w:p>
@@ -568,7 +571,7 @@
               <w:jc w:val="left"/>
             </w:pPr>
             <w:r>
-              <w:t xml:space="preserve">RUL 与故障诊断 Notebook，展示特征图、热力图和指标表</w:t>
+              <w:t xml:space="preserve">RUL 与故障诊断 CLI 流程，展示特征图、热力图和指标表</w:t>
             </w:r>
           </w:p>
         </w:tc>

</xml_diff>